<commit_message>
Update tasklist doc: remove done Student Registry + Teacher Training Critical rows
</commit_message>
<xml_diff>
--- a/docs/GAP_ANALYSIS/Multi-Web_Remaining_Work_Tasklist.docx
+++ b/docs/GAP_ANALYSIS/Multi-Web_Remaining_Work_Tasklist.docx
@@ -37,7 +37,7 @@
         <w:spacing w:after="120"/>
       </w:pPr>
       <w:r>
-        <w:t xml:space="preserve">82 tasks across 4 modules (1 marked Descoped for traceability, 81 actionable). Sports Management and Teacher Registry are fully done and not included. Talent Search's Critical exam-integrity tier is also done — only its High/Medium/Low items remain below. TC/Transfer Certificate workflow, student class-promotion/rollover, and the Division/Section field are excluded per the client's scope decisions ("not our purpose" / "dont need section for students").</w:t>
+        <w:t xml:space="preserve">64 remaining actionable tasks across 3 modules (of an original 82 tracked; 18 are now done or descoped — see note below). Sports Management and Teacher Registry (both sides, including Student Registry) are fully done and not included. Talent Search's Critical exam-integrity tier is also done — only its High/Medium/Low items remain below. Teacher Training's Critical tier (7 tasks) is now done — only its High/Medium/Low items remain below. TC/Transfer Certificate workflow, student class-promotion/rollover, and the Division/Section field are excluded per the client's scope decisions ("not our purpose" / "dont need section for students").</w:t>
       </w:r>
     </w:p>
     <w:p>
@@ -46,7 +46,7 @@
         <w:spacing w:after="150" w:before="300"/>
       </w:pPr>
       <w:r>
-        <w:t xml:space="preserve">Student Registry (FRD-02, student side) — 10 tasks, ~14-18 pd</w:t>
+        <w:t xml:space="preserve">Done — Student Registry (FRD-02, student side)</w:t>
       </w:r>
     </w:p>
     <w:p>
@@ -54,7 +54,37 @@
         <w:spacing w:after="120"/>
       </w:pPr>
       <w:r>
-        <w:t xml:space="preserve">TC workflow, promotion engine, and Division/Section field descoped; remaining Critical items mirror patterns already built for Teacher Registry.</w:t>
+        <w:rPr>
+          <w:i/>
+          <w:iCs/>
+          <w:color w:val="16794d"/>
+        </w:rPr>
+        <w:t xml:space="preserve">All 10 remaining tasks (#76-77, #79-86) found already implemented in the working tree and committed: reject-with-remarks + bulk reject, all 4 FRD notification triggers, dead-method cleanup, CSV duplicate-check, TC report gating, SoftDeletes, roster CSV/XLSX/PDF export, fest/sports controller split, composite DB index. #78 (Division/Section field) remains Descoped per client scope decision.</w:t>
+      </w:r>
+    </w:p>
+    <w:p>
+      <w:pPr>
+        <w:spacing w:after="120"/>
+      </w:pPr>
+      <w:r>
+        <w:t xml:space="preserve"/>
+      </w:r>
+    </w:p>
+    <w:p>
+      <w:pPr>
+        <w:pStyle w:val="Heading1"/>
+        <w:spacing w:after="150" w:before="300"/>
+      </w:pPr>
+      <w:r>
+        <w:t xml:space="preserve">Teacher Training (FRD-09) — 19 tasks, ~44-54 pd</w:t>
+      </w:r>
+    </w:p>
+    <w:p>
+      <w:pPr>
+        <w:spacing w:after="120"/>
+      </w:pPr>
+      <w:r>
+        <w:t xml:space="preserve">QR registration/attendance and the Critical tier (pending-school resolution, report-filter fixes, attendance-based certificate eligibility, feedback module, bulk registration/CSV, CPD tracking, eligibility builder) are done and committed. Remaining work concentrates in Resource Person management, differentiated fees, category master, and multi-type certificates.</w:t>
       </w:r>
     </w:p>
     <w:tbl>
@@ -145,1420 +175,6 @@
                 <w:bCs/>
               </w:rPr>
               <w:t xml:space="preserve">Effort</w:t>
-            </w:r>
-          </w:p>
-        </w:tc>
-      </w:tr>
-      <w:tr>
-        <w:tc>
-          <w:tcPr>
-            <w:tcW w:type="dxa" w:w="700"/>
-          </w:tcPr>
-          <w:p>
-            <w:pPr>
-              <w:jc w:val="left"/>
-            </w:pPr>
-            <w:r>
-              <w:rPr>
-                <w:b w:val="false"/>
-                <w:bCs w:val="false"/>
-              </w:rPr>
-              <w:t xml:space="preserve">76</w:t>
-            </w:r>
-          </w:p>
-        </w:tc>
-        <w:tc>
-          <w:tcPr>
-            <w:tcW w:type="dxa" w:w="1600"/>
-            <w:shd w:fill="FEE2E2" w:val="clear"/>
-          </w:tcPr>
-          <w:p>
-            <w:pPr>
-              <w:jc w:val="left"/>
-            </w:pPr>
-            <w:r>
-              <w:rPr>
-                <w:b w:val="false"/>
-                <w:bCs w:val="false"/>
-              </w:rPr>
-              <w:t xml:space="preserve">Critical</w:t>
-            </w:r>
-          </w:p>
-        </w:tc>
-        <w:tc>
-          <w:tcPr>
-            <w:tcW w:type="dxa" w:w="5200"/>
-          </w:tcPr>
-          <w:p>
-            <w:pPr>
-              <w:jc w:val="left"/>
-            </w:pPr>
-            <w:r>
-              <w:rPr>
-                <w:b w:val="false"/>
-                <w:bCs w:val="false"/>
-              </w:rPr>
-              <w:t xml:space="preserve">Reject-with-remarks + bulk reject
-Add reject()/bulkReject() to StudentVerificationController.php (mirror the Teacher-side pattern already built). Add rejection_reason column, route students.verification.reject, Reject button/modal on Verification.vue.</w:t>
-            </w:r>
-          </w:p>
-        </w:tc>
-        <w:tc>
-          <w:tcPr>
-            <w:tcW w:type="dxa" w:w="1400"/>
-          </w:tcPr>
-          <w:p>
-            <w:pPr>
-              <w:jc w:val="center"/>
-            </w:pPr>
-            <w:r>
-              <w:rPr>
-                <w:b w:val="false"/>
-                <w:bCs w:val="false"/>
-              </w:rPr>
-              <w:t xml:space="preserve">2-3d</w:t>
-            </w:r>
-          </w:p>
-        </w:tc>
-      </w:tr>
-      <w:tr>
-        <w:tc>
-          <w:tcPr>
-            <w:tcW w:type="dxa" w:w="700"/>
-          </w:tcPr>
-          <w:p>
-            <w:pPr>
-              <w:jc w:val="left"/>
-            </w:pPr>
-            <w:r>
-              <w:rPr>
-                <w:b w:val="false"/>
-                <w:bCs w:val="false"/>
-              </w:rPr>
-              <w:t xml:space="preserve">77</w:t>
-            </w:r>
-          </w:p>
-        </w:tc>
-        <w:tc>
-          <w:tcPr>
-            <w:tcW w:type="dxa" w:w="1600"/>
-            <w:shd w:fill="FEE2E2" w:val="clear"/>
-          </w:tcPr>
-          <w:p>
-            <w:pPr>
-              <w:jc w:val="left"/>
-            </w:pPr>
-            <w:r>
-              <w:rPr>
-                <w:b w:val="false"/>
-                <w:bCs w:val="false"/>
-              </w:rPr>
-              <w:t xml:space="preserve">Critical</w:t>
-            </w:r>
-          </w:p>
-        </w:tc>
-        <w:tc>
-          <w:tcPr>
-            <w:tcW w:type="dxa" w:w="5200"/>
-          </w:tcPr>
-          <w:p>
-            <w:pPr>
-              <w:jc w:val="left"/>
-            </w:pPr>
-            <w:r>
-              <w:rPr>
-                <w:b w:val="false"/>
-                <w:bCs w:val="false"/>
-              </w:rPr>
-              <w:t xml:space="preserve">Wire 4 FRD notification triggers
-Verification Pending/Approved/Rejected/Reverification Required into StudentVerificationController::verify()/reject(), StudentEditChangeService::applyChanges(), and creation paths. Seed 4 NotificationTemplate rows.</w:t>
-            </w:r>
-          </w:p>
-        </w:tc>
-        <w:tc>
-          <w:tcPr>
-            <w:tcW w:type="dxa" w:w="1400"/>
-          </w:tcPr>
-          <w:p>
-            <w:pPr>
-              <w:jc w:val="center"/>
-            </w:pPr>
-            <w:r>
-              <w:rPr>
-                <w:b w:val="false"/>
-                <w:bCs w:val="false"/>
-              </w:rPr>
-              <w:t xml:space="preserve">3-4d</w:t>
-            </w:r>
-          </w:p>
-        </w:tc>
-      </w:tr>
-      <w:tr>
-        <w:tc>
-          <w:tcPr>
-            <w:tcW w:type="dxa" w:w="700"/>
-          </w:tcPr>
-          <w:p>
-            <w:pPr>
-              <w:jc w:val="left"/>
-            </w:pPr>
-            <w:r>
-              <w:rPr>
-                <w:b w:val="false"/>
-                <w:bCs w:val="false"/>
-              </w:rPr>
-              <w:t xml:space="preserve">78</w:t>
-            </w:r>
-          </w:p>
-        </w:tc>
-        <w:tc>
-          <w:tcPr>
-            <w:tcW w:type="dxa" w:w="1600"/>
-            <w:shd w:fill="E5E7EB" w:val="clear"/>
-          </w:tcPr>
-          <w:p>
-            <w:pPr>
-              <w:jc w:val="left"/>
-            </w:pPr>
-            <w:r>
-              <w:rPr>
-                <w:b w:val="false"/>
-                <w:bCs w:val="false"/>
-              </w:rPr>
-              <w:t xml:space="preserve">Descoped</w:t>
-            </w:r>
-          </w:p>
-        </w:tc>
-        <w:tc>
-          <w:tcPr>
-            <w:tcW w:type="dxa" w:w="5200"/>
-          </w:tcPr>
-          <w:p>
-            <w:pPr>
-              <w:jc w:val="left"/>
-            </w:pPr>
-            <w:r>
-              <w:rPr>
-                <w:b w:val="false"/>
-                <w:bCs w:val="false"/>
-              </w:rPr>
-              <w:t xml:space="preserve">Restore Division/Section field
-Client: "dont need section for students." Removed from scope — not building a Division/Section column/UI.</w:t>
-            </w:r>
-          </w:p>
-        </w:tc>
-        <w:tc>
-          <w:tcPr>
-            <w:tcW w:type="dxa" w:w="1400"/>
-          </w:tcPr>
-          <w:p>
-            <w:pPr>
-              <w:jc w:val="center"/>
-            </w:pPr>
-            <w:r>
-              <w:rPr>
-                <w:b w:val="false"/>
-                <w:bCs w:val="false"/>
-              </w:rPr>
-              <w:t xml:space="preserve">—</w:t>
-            </w:r>
-          </w:p>
-        </w:tc>
-      </w:tr>
-      <w:tr>
-        <w:tc>
-          <w:tcPr>
-            <w:tcW w:type="dxa" w:w="700"/>
-          </w:tcPr>
-          <w:p>
-            <w:pPr>
-              <w:jc w:val="left"/>
-            </w:pPr>
-            <w:r>
-              <w:rPr>
-                <w:b w:val="false"/>
-                <w:bCs w:val="false"/>
-              </w:rPr>
-              <w:t xml:space="preserve">79</w:t>
-            </w:r>
-          </w:p>
-        </w:tc>
-        <w:tc>
-          <w:tcPr>
-            <w:tcW w:type="dxa" w:w="1600"/>
-            <w:shd w:fill="FEF3C7" w:val="clear"/>
-          </w:tcPr>
-          <w:p>
-            <w:pPr>
-              <w:jc w:val="left"/>
-            </w:pPr>
-            <w:r>
-              <w:rPr>
-                <w:b w:val="false"/>
-                <w:bCs w:val="false"/>
-              </w:rPr>
-              <w:t xml:space="preserve">High</w:t>
-            </w:r>
-          </w:p>
-        </w:tc>
-        <w:tc>
-          <w:tcPr>
-            <w:tcW w:type="dxa" w:w="5200"/>
-          </w:tcPr>
-          <w:p>
-            <w:pPr>
-              <w:jc w:val="left"/>
-            </w:pPr>
-            <w:r>
-              <w:rPr>
-                <w:b w:val="false"/>
-                <w:bCs w:val="false"/>
-              </w:rPr>
-              <w:t xml:space="preserve">Remove/deprecate dead 403'd verification methods
-5 dead abort(403) methods in StudentController.php (bulkProvisionPortal, verificationReport, verificationExport, verify, bulkVerify).</w:t>
-            </w:r>
-          </w:p>
-        </w:tc>
-        <w:tc>
-          <w:tcPr>
-            <w:tcW w:type="dxa" w:w="1400"/>
-          </w:tcPr>
-          <w:p>
-            <w:pPr>
-              <w:jc w:val="center"/>
-            </w:pPr>
-            <w:r>
-              <w:rPr>
-                <w:b w:val="false"/>
-                <w:bCs w:val="false"/>
-              </w:rPr>
-              <w:t xml:space="preserve">1d</w:t>
-            </w:r>
-          </w:p>
-        </w:tc>
-      </w:tr>
-      <w:tr>
-        <w:tc>
-          <w:tcPr>
-            <w:tcW w:type="dxa" w:w="700"/>
-          </w:tcPr>
-          <w:p>
-            <w:pPr>
-              <w:jc w:val="left"/>
-            </w:pPr>
-            <w:r>
-              <w:rPr>
-                <w:b w:val="false"/>
-                <w:bCs w:val="false"/>
-              </w:rPr>
-              <w:t xml:space="preserve">80</w:t>
-            </w:r>
-          </w:p>
-        </w:tc>
-        <w:tc>
-          <w:tcPr>
-            <w:tcW w:type="dxa" w:w="1600"/>
-            <w:shd w:fill="FEF3C7" w:val="clear"/>
-          </w:tcPr>
-          <w:p>
-            <w:pPr>
-              <w:jc w:val="left"/>
-            </w:pPr>
-            <w:r>
-              <w:rPr>
-                <w:b w:val="false"/>
-                <w:bCs w:val="false"/>
-              </w:rPr>
-              <w:t xml:space="preserve">High</w:t>
-            </w:r>
-          </w:p>
-        </w:tc>
-        <w:tc>
-          <w:tcPr>
-            <w:tcW w:type="dxa" w:w="5200"/>
-          </w:tcPr>
-          <w:p>
-            <w:pPr>
-              <w:jc w:val="left"/>
-            </w:pPr>
-            <w:r>
-              <w:rPr>
-                <w:b w:val="false"/>
-                <w:bCs w:val="false"/>
-              </w:rPr>
-              <w:t xml:space="preserve">Duplicate-check on CSV import
-Add name+DOB / admission_number duplicate-check (in-file and against-DB) to StudentCsvImporter::validateRows(); surface in import preview.</w:t>
-            </w:r>
-          </w:p>
-        </w:tc>
-        <w:tc>
-          <w:tcPr>
-            <w:tcW w:type="dxa" w:w="1400"/>
-          </w:tcPr>
-          <w:p>
-            <w:pPr>
-              <w:jc w:val="center"/>
-            </w:pPr>
-            <w:r>
-              <w:rPr>
-                <w:b w:val="false"/>
-                <w:bCs w:val="false"/>
-              </w:rPr>
-              <w:t xml:space="preserve">1-2d</w:t>
-            </w:r>
-          </w:p>
-        </w:tc>
-      </w:tr>
-      <w:tr>
-        <w:tc>
-          <w:tcPr>
-            <w:tcW w:type="dxa" w:w="700"/>
-          </w:tcPr>
-          <w:p>
-            <w:pPr>
-              <w:jc w:val="left"/>
-            </w:pPr>
-            <w:r>
-              <w:rPr>
-                <w:b w:val="false"/>
-                <w:bCs w:val="false"/>
-              </w:rPr>
-              <w:t xml:space="preserve">81</w:t>
-            </w:r>
-          </w:p>
-        </w:tc>
-        <w:tc>
-          <w:tcPr>
-            <w:tcW w:type="dxa" w:w="1600"/>
-            <w:shd w:fill="DBEAFE" w:val="clear"/>
-          </w:tcPr>
-          <w:p>
-            <w:pPr>
-              <w:jc w:val="left"/>
-            </w:pPr>
-            <w:r>
-              <w:rPr>
-                <w:b w:val="false"/>
-                <w:bCs w:val="false"/>
-              </w:rPr>
-              <w:t xml:space="preserve">Medium</w:t>
-            </w:r>
-          </w:p>
-        </w:tc>
-        <w:tc>
-          <w:tcPr>
-            <w:tcW w:type="dxa" w:w="5200"/>
-          </w:tcPr>
-          <w:p>
-            <w:pPr>
-              <w:jc w:val="left"/>
-            </w:pPr>
-            <w:r>
-              <w:rPr>
-                <w:b w:val="false"/>
-                <w:bCs w:val="false"/>
-              </w:rPr>
-              <w:t xml:space="preserve">Hide/gate Transfer-TC log report
-RPT-STU-015 points at a permanently-empty tc_requests table now that TC workflow is descoped — hide or gate rather than leave it "runnable".</w:t>
-            </w:r>
-          </w:p>
-        </w:tc>
-        <w:tc>
-          <w:tcPr>
-            <w:tcW w:type="dxa" w:w="1400"/>
-          </w:tcPr>
-          <w:p>
-            <w:pPr>
-              <w:jc w:val="center"/>
-            </w:pPr>
-            <w:r>
-              <w:rPr>
-                <w:b w:val="false"/>
-                <w:bCs w:val="false"/>
-              </w:rPr>
-              <w:t xml:space="preserve">0.5d</w:t>
-            </w:r>
-          </w:p>
-        </w:tc>
-      </w:tr>
-      <w:tr>
-        <w:tc>
-          <w:tcPr>
-            <w:tcW w:type="dxa" w:w="700"/>
-          </w:tcPr>
-          <w:p>
-            <w:pPr>
-              <w:jc w:val="left"/>
-            </w:pPr>
-            <w:r>
-              <w:rPr>
-                <w:b w:val="false"/>
-                <w:bCs w:val="false"/>
-              </w:rPr>
-              <w:t xml:space="preserve">82</w:t>
-            </w:r>
-          </w:p>
-        </w:tc>
-        <w:tc>
-          <w:tcPr>
-            <w:tcW w:type="dxa" w:w="1600"/>
-            <w:shd w:fill="DBEAFE" w:val="clear"/>
-          </w:tcPr>
-          <w:p>
-            <w:pPr>
-              <w:jc w:val="left"/>
-            </w:pPr>
-            <w:r>
-              <w:rPr>
-                <w:b w:val="false"/>
-                <w:bCs w:val="false"/>
-              </w:rPr>
-              <w:t xml:space="preserve">Medium</w:t>
-            </w:r>
-          </w:p>
-        </w:tc>
-        <w:tc>
-          <w:tcPr>
-            <w:tcW w:type="dxa" w:w="5200"/>
-          </w:tcPr>
-          <w:p>
-            <w:pPr>
-              <w:jc w:val="left"/>
-            </w:pPr>
-            <w:r>
-              <w:rPr>
-                <w:b w:val="false"/>
-                <w:bCs w:val="false"/>
-              </w:rPr>
-              <w:t xml:space="preserve">SoftDeletes on Student
-Add SoftDeletes + migration; change destroy() from hard delete to soft delete/withdrawn status.</w:t>
-            </w:r>
-          </w:p>
-        </w:tc>
-        <w:tc>
-          <w:tcPr>
-            <w:tcW w:type="dxa" w:w="1400"/>
-          </w:tcPr>
-          <w:p>
-            <w:pPr>
-              <w:jc w:val="center"/>
-            </w:pPr>
-            <w:r>
-              <w:rPr>
-                <w:b w:val="false"/>
-                <w:bCs w:val="false"/>
-              </w:rPr>
-              <w:t xml:space="preserve">1d</w:t>
-            </w:r>
-          </w:p>
-        </w:tc>
-      </w:tr>
-      <w:tr>
-        <w:tc>
-          <w:tcPr>
-            <w:tcW w:type="dxa" w:w="700"/>
-          </w:tcPr>
-          <w:p>
-            <w:pPr>
-              <w:jc w:val="left"/>
-            </w:pPr>
-            <w:r>
-              <w:rPr>
-                <w:b w:val="false"/>
-                <w:bCs w:val="false"/>
-              </w:rPr>
-              <w:t xml:space="preserve">83</w:t>
-            </w:r>
-          </w:p>
-        </w:tc>
-        <w:tc>
-          <w:tcPr>
-            <w:tcW w:type="dxa" w:w="1600"/>
-            <w:shd w:fill="DBEAFE" w:val="clear"/>
-          </w:tcPr>
-          <w:p>
-            <w:pPr>
-              <w:jc w:val="left"/>
-            </w:pPr>
-            <w:r>
-              <w:rPr>
-                <w:b w:val="false"/>
-                <w:bCs w:val="false"/>
-              </w:rPr>
-              <w:t xml:space="preserve">Medium</w:t>
-            </w:r>
-          </w:p>
-        </w:tc>
-        <w:tc>
-          <w:tcPr>
-            <w:tcW w:type="dxa" w:w="5200"/>
-          </w:tcPr>
-          <w:p>
-            <w:pPr>
-              <w:jc w:val="left"/>
-            </w:pPr>
-            <w:r>
-              <w:rPr>
-                <w:b w:val="false"/>
-                <w:bCs w:val="false"/>
-              </w:rPr>
-              <w:t xml:space="preserve">Plain student-roster export
-CSV/XLSX export button on Students Index, reusing/extending verificationExport().</w:t>
-            </w:r>
-          </w:p>
-        </w:tc>
-        <w:tc>
-          <w:tcPr>
-            <w:tcW w:type="dxa" w:w="1400"/>
-          </w:tcPr>
-          <w:p>
-            <w:pPr>
-              <w:jc w:val="center"/>
-            </w:pPr>
-            <w:r>
-              <w:rPr>
-                <w:b w:val="false"/>
-                <w:bCs w:val="false"/>
-              </w:rPr>
-              <w:t xml:space="preserve">1d</w:t>
-            </w:r>
-          </w:p>
-        </w:tc>
-      </w:tr>
-      <w:tr>
-        <w:tc>
-          <w:tcPr>
-            <w:tcW w:type="dxa" w:w="700"/>
-          </w:tcPr>
-          <w:p>
-            <w:pPr>
-              <w:jc w:val="left"/>
-            </w:pPr>
-            <w:r>
-              <w:rPr>
-                <w:b w:val="false"/>
-                <w:bCs w:val="false"/>
-              </w:rPr>
-              <w:t xml:space="preserve">84</w:t>
-            </w:r>
-          </w:p>
-        </w:tc>
-        <w:tc>
-          <w:tcPr>
-            <w:tcW w:type="dxa" w:w="1600"/>
-            <w:shd w:fill="F1F5F9" w:val="clear"/>
-          </w:tcPr>
-          <w:p>
-            <w:pPr>
-              <w:jc w:val="left"/>
-            </w:pPr>
-            <w:r>
-              <w:rPr>
-                <w:b w:val="false"/>
-                <w:bCs w:val="false"/>
-              </w:rPr>
-              <w:t xml:space="preserve">Low</w:t>
-            </w:r>
-          </w:p>
-        </w:tc>
-        <w:tc>
-          <w:tcPr>
-            <w:tcW w:type="dxa" w:w="5200"/>
-          </w:tcPr>
-          <w:p>
-            <w:pPr>
-              <w:jc w:val="left"/>
-            </w:pPr>
-            <w:r>
-              <w:rPr>
-                <w:b w:val="false"/>
-                <w:bCs w:val="false"/>
-              </w:rPr>
-              <w:t xml:space="preserve">Split fest/sports methods out of StudentController
-Move registerSportsEvent, registerSportsItems, eligibleSportsItems, festIdCard into a dedicated Fest/Sports controller.</w:t>
-            </w:r>
-          </w:p>
-        </w:tc>
-        <w:tc>
-          <w:tcPr>
-            <w:tcW w:type="dxa" w:w="1400"/>
-          </w:tcPr>
-          <w:p>
-            <w:pPr>
-              <w:jc w:val="center"/>
-            </w:pPr>
-            <w:r>
-              <w:rPr>
-                <w:b w:val="false"/>
-                <w:bCs w:val="false"/>
-              </w:rPr>
-              <w:t xml:space="preserve">2d</w:t>
-            </w:r>
-          </w:p>
-        </w:tc>
-      </w:tr>
-      <w:tr>
-        <w:tc>
-          <w:tcPr>
-            <w:tcW w:type="dxa" w:w="700"/>
-          </w:tcPr>
-          <w:p>
-            <w:pPr>
-              <w:jc w:val="left"/>
-            </w:pPr>
-            <w:r>
-              <w:rPr>
-                <w:b w:val="false"/>
-                <w:bCs w:val="false"/>
-              </w:rPr>
-              <w:t xml:space="preserve">85</w:t>
-            </w:r>
-          </w:p>
-        </w:tc>
-        <w:tc>
-          <w:tcPr>
-            <w:tcW w:type="dxa" w:w="1600"/>
-            <w:shd w:fill="F1F5F9" w:val="clear"/>
-          </w:tcPr>
-          <w:p>
-            <w:pPr>
-              <w:jc w:val="left"/>
-            </w:pPr>
-            <w:r>
-              <w:rPr>
-                <w:b w:val="false"/>
-                <w:bCs w:val="false"/>
-              </w:rPr>
-              <w:t xml:space="preserve">Low</w:t>
-            </w:r>
-          </w:p>
-        </w:tc>
-        <w:tc>
-          <w:tcPr>
-            <w:tcW w:type="dxa" w:w="5200"/>
-          </w:tcPr>
-          <w:p>
-            <w:pPr>
-              <w:jc w:val="left"/>
-            </w:pPr>
-            <w:r>
-              <w:rPr>
-                <w:b w:val="false"/>
-                <w:bCs w:val="false"/>
-              </w:rPr>
-              <w:t xml:space="preserve">Composite DB index
-students(tenant_id, school_class_id, status) for list/report performance at scale.</w:t>
-            </w:r>
-          </w:p>
-        </w:tc>
-        <w:tc>
-          <w:tcPr>
-            <w:tcW w:type="dxa" w:w="1400"/>
-          </w:tcPr>
-          <w:p>
-            <w:pPr>
-              <w:jc w:val="center"/>
-            </w:pPr>
-            <w:r>
-              <w:rPr>
-                <w:b w:val="false"/>
-                <w:bCs w:val="false"/>
-              </w:rPr>
-              <w:t xml:space="preserve">0.5d</w:t>
-            </w:r>
-          </w:p>
-        </w:tc>
-      </w:tr>
-      <w:tr>
-        <w:tc>
-          <w:tcPr>
-            <w:tcW w:type="dxa" w:w="700"/>
-          </w:tcPr>
-          <w:p>
-            <w:pPr>
-              <w:jc w:val="left"/>
-            </w:pPr>
-            <w:r>
-              <w:rPr>
-                <w:b w:val="false"/>
-                <w:bCs w:val="false"/>
-              </w:rPr>
-              <w:t xml:space="preserve">86</w:t>
-            </w:r>
-          </w:p>
-        </w:tc>
-        <w:tc>
-          <w:tcPr>
-            <w:tcW w:type="dxa" w:w="1600"/>
-            <w:shd w:fill="F1F5F9" w:val="clear"/>
-          </w:tcPr>
-          <w:p>
-            <w:pPr>
-              <w:jc w:val="left"/>
-            </w:pPr>
-            <w:r>
-              <w:rPr>
-                <w:b w:val="false"/>
-                <w:bCs w:val="false"/>
-              </w:rPr>
-              <w:t xml:space="preserve">Low</w:t>
-            </w:r>
-          </w:p>
-        </w:tc>
-        <w:tc>
-          <w:tcPr>
-            <w:tcW w:type="dxa" w:w="5200"/>
-          </w:tcPr>
-          <w:p>
-            <w:pPr>
-              <w:jc w:val="left"/>
-            </w:pPr>
-            <w:r>
-              <w:rPr>
-                <w:b w:val="false"/>
-                <w:bCs w:val="false"/>
-              </w:rPr>
-              <w:t xml:space="preserve">PDF export/print view for student roster
-Mirror the Teacher roster PDF export just built (DomPDF, a4 landscape).</w:t>
-            </w:r>
-          </w:p>
-        </w:tc>
-        <w:tc>
-          <w:tcPr>
-            <w:tcW w:type="dxa" w:w="1400"/>
-          </w:tcPr>
-          <w:p>
-            <w:pPr>
-              <w:jc w:val="center"/>
-            </w:pPr>
-            <w:r>
-              <w:rPr>
-                <w:b w:val="false"/>
-                <w:bCs w:val="false"/>
-              </w:rPr>
-              <w:t xml:space="preserve">2-3d</w:t>
-            </w:r>
-          </w:p>
-        </w:tc>
-      </w:tr>
-    </w:tbl>
-    <w:p>
-      <w:pPr>
-        <w:spacing w:after="120"/>
-      </w:pPr>
-      <w:r>
-        <w:t xml:space="preserve"/>
-      </w:r>
-    </w:p>
-    <w:p>
-      <w:pPr>
-        <w:pStyle w:val="Heading1"/>
-        <w:spacing w:after="150" w:before="300"/>
-      </w:pPr>
-      <w:r>
-        <w:t xml:space="preserve">Teacher Training (FRD-09) — 26 tasks, ~65-75 pd</w:t>
-      </w:r>
-    </w:p>
-    <w:p>
-      <w:pPr>
-        <w:spacing w:after="120"/>
-      </w:pPr>
-      <w:r>
-        <w:t xml:space="preserve">QR registration/attendance already shipped. Remaining work concentrates in Feedback, CPD, Resource Person management, differentiated fees, and the eligibility builder.</w:t>
-      </w:r>
-    </w:p>
-    <w:tbl>
-      <w:tblPr>
-        <w:tblW w:type="dxa" w:w="8900"/>
-        <w:tblBorders>
-          <w:top w:val="single" w:color="auto" w:sz="4"/>
-          <w:left w:val="single" w:color="auto" w:sz="4"/>
-          <w:bottom w:val="single" w:color="auto" w:sz="4"/>
-          <w:right w:val="single" w:color="auto" w:sz="4"/>
-          <w:insideH w:val="single" w:color="auto" w:sz="4"/>
-          <w:insideV w:val="single" w:color="auto" w:sz="4"/>
-        </w:tblBorders>
-      </w:tblPr>
-      <w:tblGrid>
-        <w:gridCol w:w="700"/>
-        <w:gridCol w:w="1600"/>
-        <w:gridCol w:w="5200"/>
-        <w:gridCol w:w="1400"/>
-      </w:tblGrid>
-      <w:tr>
-        <w:tc>
-          <w:tcPr>
-            <w:tcW w:type="dxa" w:w="700"/>
-            <w:shd w:fill="0f3d7a" w:val="clear"/>
-          </w:tcPr>
-          <w:p>
-            <w:pPr>
-              <w:jc w:val="left"/>
-            </w:pPr>
-            <w:r>
-              <w:rPr>
-                <w:b/>
-                <w:bCs/>
-              </w:rPr>
-              <w:t xml:space="preserve">#</w:t>
-            </w:r>
-          </w:p>
-        </w:tc>
-        <w:tc>
-          <w:tcPr>
-            <w:tcW w:type="dxa" w:w="1600"/>
-            <w:shd w:fill="0f3d7a" w:val="clear"/>
-          </w:tcPr>
-          <w:p>
-            <w:pPr>
-              <w:jc w:val="left"/>
-            </w:pPr>
-            <w:r>
-              <w:rPr>
-                <w:b/>
-                <w:bCs/>
-              </w:rPr>
-              <w:t xml:space="preserve">Tier</w:t>
-            </w:r>
-          </w:p>
-        </w:tc>
-        <w:tc>
-          <w:tcPr>
-            <w:tcW w:type="dxa" w:w="5200"/>
-            <w:shd w:fill="0f3d7a" w:val="clear"/>
-          </w:tcPr>
-          <w:p>
-            <w:pPr>
-              <w:jc w:val="left"/>
-            </w:pPr>
-            <w:r>
-              <w:rPr>
-                <w:b/>
-                <w:bCs/>
-              </w:rPr>
-              <w:t xml:space="preserve">Task</w:t>
-            </w:r>
-          </w:p>
-        </w:tc>
-        <w:tc>
-          <w:tcPr>
-            <w:tcW w:type="dxa" w:w="1400"/>
-            <w:shd w:fill="0f3d7a" w:val="clear"/>
-          </w:tcPr>
-          <w:p>
-            <w:pPr>
-              <w:jc w:val="left"/>
-            </w:pPr>
-            <w:r>
-              <w:rPr>
-                <w:b/>
-                <w:bCs/>
-              </w:rPr>
-              <w:t xml:space="preserve">Effort</w:t>
-            </w:r>
-          </w:p>
-        </w:tc>
-      </w:tr>
-      <w:tr>
-        <w:tc>
-          <w:tcPr>
-            <w:tcW w:type="dxa" w:w="700"/>
-          </w:tcPr>
-          <w:p>
-            <w:pPr>
-              <w:jc w:val="left"/>
-            </w:pPr>
-            <w:r>
-              <w:rPr>
-                <w:b w:val="false"/>
-                <w:bCs w:val="false"/>
-              </w:rPr>
-              <w:t xml:space="preserve">87</w:t>
-            </w:r>
-          </w:p>
-        </w:tc>
-        <w:tc>
-          <w:tcPr>
-            <w:tcW w:type="dxa" w:w="1600"/>
-            <w:shd w:fill="FEE2E2" w:val="clear"/>
-          </w:tcPr>
-          <w:p>
-            <w:pPr>
-              <w:jc w:val="left"/>
-            </w:pPr>
-            <w:r>
-              <w:rPr>
-                <w:b w:val="false"/>
-                <w:bCs w:val="false"/>
-              </w:rPr>
-              <w:t xml:space="preserve">Critical</w:t>
-            </w:r>
-          </w:p>
-        </w:tc>
-        <w:tc>
-          <w:tcPr>
-            <w:tcW w:type="dxa" w:w="5200"/>
-          </w:tcPr>
-          <w:p>
-            <w:pPr>
-              <w:jc w:val="left"/>
-            </w:pPr>
-            <w:r>
-              <w:rPr>
-                <w:b w:val="false"/>
-                <w:bCs w:val="false"/>
-              </w:rPr>
-              <w:t xml:space="preserve">Pending-school resolution admin screen
-Link TrainingPendingSchool.linked_school_id/status to a real Tenant, or reject; backfill affected TrainingRegistration.school_id.</w:t>
-            </w:r>
-          </w:p>
-        </w:tc>
-        <w:tc>
-          <w:tcPr>
-            <w:tcW w:type="dxa" w:w="1400"/>
-          </w:tcPr>
-          <w:p>
-            <w:pPr>
-              <w:jc w:val="center"/>
-            </w:pPr>
-            <w:r>
-              <w:rPr>
-                <w:b w:val="false"/>
-                <w:bCs w:val="false"/>
-              </w:rPr>
-              <w:t xml:space="preserve">2.5d</w:t>
-            </w:r>
-          </w:p>
-        </w:tc>
-      </w:tr>
-      <w:tr>
-        <w:tc>
-          <w:tcPr>
-            <w:tcW w:type="dxa" w:w="700"/>
-          </w:tcPr>
-          <w:p>
-            <w:pPr>
-              <w:jc w:val="left"/>
-            </w:pPr>
-            <w:r>
-              <w:rPr>
-                <w:b w:val="false"/>
-                <w:bCs w:val="false"/>
-              </w:rPr>
-              <w:t xml:space="preserve">88</w:t>
-            </w:r>
-          </w:p>
-        </w:tc>
-        <w:tc>
-          <w:tcPr>
-            <w:tcW w:type="dxa" w:w="1600"/>
-            <w:shd w:fill="FEE2E2" w:val="clear"/>
-          </w:tcPr>
-          <w:p>
-            <w:pPr>
-              <w:jc w:val="left"/>
-            </w:pPr>
-            <w:r>
-              <w:rPr>
-                <w:b w:val="false"/>
-                <w:bCs w:val="false"/>
-              </w:rPr>
-              <w:t xml:space="preserve">Critical</w:t>
-            </w:r>
-          </w:p>
-        </w:tc>
-        <w:tc>
-          <w:tcPr>
-            <w:tcW w:type="dxa" w:w="5200"/>
-          </w:tcPr>
-          <w:p>
-            <w:pPr>
-              <w:jc w:val="left"/>
-            </w:pPr>
-            <w:r>
-              <w:rPr>
-                <w:b w:val="false"/>
-                <w:bCs w:val="false"/>
-              </w:rPr>
-              <w:t xml:space="preserve">Fix 3 broken report status filters
-QueriesExtendedReports.php ~1143/1161/1194 use invalid status values ('approved'/'submitted'/'pending') — reports return empty.</w:t>
-            </w:r>
-          </w:p>
-        </w:tc>
-        <w:tc>
-          <w:tcPr>
-            <w:tcW w:type="dxa" w:w="1400"/>
-          </w:tcPr>
-          <w:p>
-            <w:pPr>
-              <w:jc w:val="center"/>
-            </w:pPr>
-            <w:r>
-              <w:rPr>
-                <w:b w:val="false"/>
-                <w:bCs w:val="false"/>
-              </w:rPr>
-              <w:t xml:space="preserve">0.5d</w:t>
-            </w:r>
-          </w:p>
-        </w:tc>
-      </w:tr>
-      <w:tr>
-        <w:tc>
-          <w:tcPr>
-            <w:tcW w:type="dxa" w:w="700"/>
-          </w:tcPr>
-          <w:p>
-            <w:pPr>
-              <w:jc w:val="left"/>
-            </w:pPr>
-            <w:r>
-              <w:rPr>
-                <w:b w:val="false"/>
-                <w:bCs w:val="false"/>
-              </w:rPr>
-              <w:t xml:space="preserve">89</w:t>
-            </w:r>
-          </w:p>
-        </w:tc>
-        <w:tc>
-          <w:tcPr>
-            <w:tcW w:type="dxa" w:w="1600"/>
-            <w:shd w:fill="FEE2E2" w:val="clear"/>
-          </w:tcPr>
-          <w:p>
-            <w:pPr>
-              <w:jc w:val="left"/>
-            </w:pPr>
-            <w:r>
-              <w:rPr>
-                <w:b w:val="false"/>
-                <w:bCs w:val="false"/>
-              </w:rPr>
-              <w:t xml:space="preserve">Critical</w:t>
-            </w:r>
-          </w:p>
-        </w:tc>
-        <w:tc>
-          <w:tcPr>
-            <w:tcW w:type="dxa" w:w="5200"/>
-          </w:tcPr>
-          <w:p>
-            <w:pPr>
-              <w:jc w:val="left"/>
-            </w:pPr>
-            <w:r>
-              <w:rPr>
-                <w:b w:val="false"/>
-                <w:bCs w:val="false"/>
-              </w:rPr>
-              <w:t xml:space="preserve">Configurable attendance-based certificate eligibility
-Add min_attendance_percent to training_programs; update TrainingCertificateService::assertEligible() to compute against it.</w:t>
-            </w:r>
-          </w:p>
-        </w:tc>
-        <w:tc>
-          <w:tcPr>
-            <w:tcW w:type="dxa" w:w="1400"/>
-          </w:tcPr>
-          <w:p>
-            <w:pPr>
-              <w:jc w:val="center"/>
-            </w:pPr>
-            <w:r>
-              <w:rPr>
-                <w:b w:val="false"/>
-                <w:bCs w:val="false"/>
-              </w:rPr>
-              <w:t xml:space="preserve">1.5d</w:t>
-            </w:r>
-          </w:p>
-        </w:tc>
-      </w:tr>
-      <w:tr>
-        <w:tc>
-          <w:tcPr>
-            <w:tcW w:type="dxa" w:w="700"/>
-          </w:tcPr>
-          <w:p>
-            <w:pPr>
-              <w:jc w:val="left"/>
-            </w:pPr>
-            <w:r>
-              <w:rPr>
-                <w:b w:val="false"/>
-                <w:bCs w:val="false"/>
-              </w:rPr>
-              <w:t xml:space="preserve">90</w:t>
-            </w:r>
-          </w:p>
-        </w:tc>
-        <w:tc>
-          <w:tcPr>
-            <w:tcW w:type="dxa" w:w="1600"/>
-            <w:shd w:fill="FEE2E2" w:val="clear"/>
-          </w:tcPr>
-          <w:p>
-            <w:pPr>
-              <w:jc w:val="left"/>
-            </w:pPr>
-            <w:r>
-              <w:rPr>
-                <w:b w:val="false"/>
-                <w:bCs w:val="false"/>
-              </w:rPr>
-              <w:t xml:space="preserve">Critical</w:t>
-            </w:r>
-          </w:p>
-        </w:tc>
-        <w:tc>
-          <w:tcPr>
-            <w:tcW w:type="dxa" w:w="5200"/>
-          </w:tcPr>
-          <w:p>
-            <w:pPr>
-              <w:jc w:val="left"/>
-            </w:pPr>
-            <w:r>
-              <w:rPr>
-                <w:b w:val="false"/>
-                <w:bCs w:val="false"/>
-              </w:rPr>
-              <w:t xml:space="preserve">Feedback/evaluation module
-New training_feedback table, teacher-portal feedback form, Sahodaya review screen; fix RPT-TRN-008 to use real data.</w:t>
-            </w:r>
-          </w:p>
-        </w:tc>
-        <w:tc>
-          <w:tcPr>
-            <w:tcW w:type="dxa" w:w="1400"/>
-          </w:tcPr>
-          <w:p>
-            <w:pPr>
-              <w:jc w:val="center"/>
-            </w:pPr>
-            <w:r>
-              <w:rPr>
-                <w:b w:val="false"/>
-                <w:bCs w:val="false"/>
-              </w:rPr>
-              <w:t xml:space="preserve">5d</w:t>
-            </w:r>
-          </w:p>
-        </w:tc>
-      </w:tr>
-      <w:tr>
-        <w:tc>
-          <w:tcPr>
-            <w:tcW w:type="dxa" w:w="700"/>
-          </w:tcPr>
-          <w:p>
-            <w:pPr>
-              <w:jc w:val="left"/>
-            </w:pPr>
-            <w:r>
-              <w:rPr>
-                <w:b w:val="false"/>
-                <w:bCs w:val="false"/>
-              </w:rPr>
-              <w:t xml:space="preserve">91</w:t>
-            </w:r>
-          </w:p>
-        </w:tc>
-        <w:tc>
-          <w:tcPr>
-            <w:tcW w:type="dxa" w:w="1600"/>
-            <w:shd w:fill="FEE2E2" w:val="clear"/>
-          </w:tcPr>
-          <w:p>
-            <w:pPr>
-              <w:jc w:val="left"/>
-            </w:pPr>
-            <w:r>
-              <w:rPr>
-                <w:b w:val="false"/>
-                <w:bCs w:val="false"/>
-              </w:rPr>
-              <w:t xml:space="preserve">Critical</w:t>
-            </w:r>
-          </w:p>
-        </w:tc>
-        <w:tc>
-          <w:tcPr>
-            <w:tcW w:type="dxa" w:w="5200"/>
-          </w:tcPr>
-          <w:p>
-            <w:pPr>
-              <w:jc w:val="left"/>
-            </w:pPr>
-            <w:r>
-              <w:rPr>
-                <w:b w:val="false"/>
-                <w:bCs w:val="false"/>
-              </w:rPr>
-              <w:t xml:space="preserve">Bulk registration + CSV import/export
-Extend SchoolAdmin\TrainingRegistrationController with bulk-select + CSV import/export and per-row error report.</w:t>
-            </w:r>
-          </w:p>
-        </w:tc>
-        <w:tc>
-          <w:tcPr>
-            <w:tcW w:type="dxa" w:w="1400"/>
-          </w:tcPr>
-          <w:p>
-            <w:pPr>
-              <w:jc w:val="center"/>
-            </w:pPr>
-            <w:r>
-              <w:rPr>
-                <w:b w:val="false"/>
-                <w:bCs w:val="false"/>
-              </w:rPr>
-              <w:t xml:space="preserve">5d</w:t>
-            </w:r>
-          </w:p>
-        </w:tc>
-      </w:tr>
-      <w:tr>
-        <w:tc>
-          <w:tcPr>
-            <w:tcW w:type="dxa" w:w="700"/>
-          </w:tcPr>
-          <w:p>
-            <w:pPr>
-              <w:jc w:val="left"/>
-            </w:pPr>
-            <w:r>
-              <w:rPr>
-                <w:b w:val="false"/>
-                <w:bCs w:val="false"/>
-              </w:rPr>
-              <w:t xml:space="preserve">92</w:t>
-            </w:r>
-          </w:p>
-        </w:tc>
-        <w:tc>
-          <w:tcPr>
-            <w:tcW w:type="dxa" w:w="1600"/>
-            <w:shd w:fill="FEE2E2" w:val="clear"/>
-          </w:tcPr>
-          <w:p>
-            <w:pPr>
-              <w:jc w:val="left"/>
-            </w:pPr>
-            <w:r>
-              <w:rPr>
-                <w:b w:val="false"/>
-                <w:bCs w:val="false"/>
-              </w:rPr>
-              <w:t xml:space="preserve">Critical</w:t>
-            </w:r>
-          </w:p>
-        </w:tc>
-        <w:tc>
-          <w:tcPr>
-            <w:tcW w:type="dxa" w:w="5200"/>
-          </w:tcPr>
-          <w:p>
-            <w:pPr>
-              <w:jc w:val="left"/>
-            </w:pPr>
-            <w:r>
-              <w:rPr>
-                <w:b w:val="false"/>
-                <w:bCs w:val="false"/>
-              </w:rPr>
-              <w:t xml:space="preserve">CPD / training-hours tracking
-Sum duration_minutes per teacher per year; CPD dashboard widget; extend RPT-TRN-007; add school-wise CPD report.</w:t>
-            </w:r>
-          </w:p>
-        </w:tc>
-        <w:tc>
-          <w:tcPr>
-            <w:tcW w:type="dxa" w:w="1400"/>
-          </w:tcPr>
-          <w:p>
-            <w:pPr>
-              <w:jc w:val="center"/>
-            </w:pPr>
-            <w:r>
-              <w:rPr>
-                <w:b w:val="false"/>
-                <w:bCs w:val="false"/>
-              </w:rPr>
-              <w:t xml:space="preserve">5d</w:t>
-            </w:r>
-          </w:p>
-        </w:tc>
-      </w:tr>
-      <w:tr>
-        <w:tc>
-          <w:tcPr>
-            <w:tcW w:type="dxa" w:w="700"/>
-          </w:tcPr>
-          <w:p>
-            <w:pPr>
-              <w:jc w:val="left"/>
-            </w:pPr>
-            <w:r>
-              <w:rPr>
-                <w:b w:val="false"/>
-                <w:bCs w:val="false"/>
-              </w:rPr>
-              <w:t xml:space="preserve">93</w:t>
-            </w:r>
-          </w:p>
-        </w:tc>
-        <w:tc>
-          <w:tcPr>
-            <w:tcW w:type="dxa" w:w="1600"/>
-            <w:shd w:fill="FEE2E2" w:val="clear"/>
-          </w:tcPr>
-          <w:p>
-            <w:pPr>
-              <w:jc w:val="left"/>
-            </w:pPr>
-            <w:r>
-              <w:rPr>
-                <w:b w:val="false"/>
-                <w:bCs w:val="false"/>
-              </w:rPr>
-              <w:t xml:space="preserve">Critical</w:t>
-            </w:r>
-          </w:p>
-        </w:tc>
-        <w:tc>
-          <w:tcPr>
-            <w:tcW w:type="dxa" w:w="5200"/>
-          </w:tcPr>
-          <w:p>
-            <w:pPr>
-              <w:jc w:val="left"/>
-            </w:pPr>
-            <w:r>
-              <w:rPr>
-                <w:b w:val="false"/>
-                <w:bCs w:val="false"/>
-              </w:rPr>
-              <w:t xml:space="preserve">Richer eligibility builder
-Designation-exclude, min-experience, prior-training, region — likely a new training_program_eligibility_rules table.</w:t>
-            </w:r>
-          </w:p>
-        </w:tc>
-        <w:tc>
-          <w:tcPr>
-            <w:tcW w:type="dxa" w:w="1400"/>
-          </w:tcPr>
-          <w:p>
-            <w:pPr>
-              <w:jc w:val="center"/>
-            </w:pPr>
-            <w:r>
-              <w:rPr>
-                <w:b w:val="false"/>
-                <w:bCs w:val="false"/>
-              </w:rPr>
-              <w:t xml:space="preserve">6d</w:t>
             </w:r>
           </w:p>
         </w:tc>

</xml_diff>